<commit_message>
Enhance ExcelReaderService to preserve leading zeros in contract numbers and improve data extraction methods
</commit_message>
<xml_diff>
--- a/Modelos_documentos/oficio_admin_contrato.docx
+++ b/Modelos_documentos/oficio_admin_contrato.docx
@@ -159,7 +159,7 @@
           <w:szCs w:val="24"/>
           <w:lang w:val="es-PE"/>
         </w:rPr>
-        <w:t>4 de Marzo de 2026</w:t>
+        <w:t>10 de Marzo de 2026</w:t>
       </w:r>
       <w:r>
         <w:rPr>
@@ -398,7 +398,7 @@
           <w:b/>
           <w:bCs/>
         </w:rPr>
-        <w:t>c</w:t>
+        <w:t>C</w:t>
       </w:r>
       <w:r>
         <w:rPr>
@@ -515,15 +515,86 @@
           <w:rFonts w:ascii="Garamond" w:eastAsia="Arial MT" w:hAnsi="Garamond" w:cs="Arial"/>
           <w:spacing w:val="1"/>
         </w:rPr>
-        <w:t>Es grato dirigirme a usted, para saludarlo cordialmente y, a la vez solicitarle el</w:t>
-      </w:r>
-      <w:r>
-        <w:rPr>
-          <w:rFonts w:ascii="Garamond" w:eastAsia="Arial MT" w:hAnsi="Garamond" w:cs="Arial"/>
-          <w:spacing w:val="1"/>
-        </w:rPr>
-        <w:t xml:space="preserve"> descripcion</w:t>
-      </w:r>
+        <w:t xml:space="preserve">Es grato dirigirme a usted, para saludarlo cordialmente y, a la vez solicitarle </w:t>
+      </w:r>
+      <w:r>
+        <w:rPr>
+          <w:rFonts w:ascii="Garamond" w:eastAsia="Arial MT" w:hAnsi="Garamond" w:cs="Arial"/>
+          <w:spacing w:val="1"/>
+        </w:rPr>
+        <w:t xml:space="preserve">se sirva a autorizar el pago a favor de </w:t>
+      </w:r>
+      <w:r>
+        <w:rPr>
+          <w:rFonts w:ascii="Garamond" w:eastAsia="Arial MT" w:hAnsi="Garamond" w:cs="Arial"/>
+          <w:b/>
+          <w:bCs/>
+          <w:spacing w:val="1"/>
+        </w:rPr>
+        <w:t>docente</w:t>
+      </w:r>
+      <w:r>
+        <w:rPr>
+          <w:rFonts w:ascii="Garamond" w:eastAsia="Arial MT" w:hAnsi="Garamond" w:cs="Arial"/>
+          <w:spacing w:val="1"/>
+        </w:rPr>
+        <w:t xml:space="preserve">, bajo el Contrato de Locación de Servicios </w:t>
+      </w:r>
+      <w:proofErr w:type="spellStart"/>
+      <w:r>
+        <w:rPr>
+          <w:rFonts w:ascii="Garamond" w:eastAsia="Arial MT" w:hAnsi="Garamond" w:cs="Arial"/>
+          <w:spacing w:val="1"/>
+        </w:rPr>
+        <w:t>N.°</w:t>
+      </w:r>
+      <w:proofErr w:type="spellEnd"/>
+      <w:r>
+        <w:rPr>
+          <w:rFonts w:ascii="Garamond" w:eastAsia="Arial MT" w:hAnsi="Garamond" w:cs="Arial"/>
+          <w:spacing w:val="1"/>
+        </w:rPr>
+        <w:t xml:space="preserve"> </w:t>
+      </w:r>
+      <w:proofErr w:type="spellStart"/>
+      <w:r>
+        <w:rPr>
+          <w:rFonts w:ascii="Garamond" w:eastAsia="Arial MT" w:hAnsi="Garamond" w:cs="Arial"/>
+          <w:spacing w:val="1"/>
+        </w:rPr>
+        <w:t>Nro_Contrato</w:t>
+      </w:r>
+      <w:proofErr w:type="spellEnd"/>
+      <w:r>
+        <w:rPr>
+          <w:rFonts w:ascii="Garamond" w:eastAsia="Arial MT" w:hAnsi="Garamond" w:cs="Arial"/>
+          <w:spacing w:val="1"/>
+        </w:rPr>
+        <w:t xml:space="preserve">/UNMSM-FLCH/2026 por </w:t>
+      </w:r>
+      <w:r>
+        <w:rPr>
+          <w:rFonts w:ascii="Garamond" w:eastAsia="Arial MT" w:hAnsi="Garamond" w:cs="Arial"/>
+          <w:spacing w:val="1"/>
+        </w:rPr>
+        <w:t>el</w:t>
+      </w:r>
+      <w:r>
+        <w:rPr>
+          <w:rFonts w:ascii="Garamond" w:eastAsia="Arial MT" w:hAnsi="Garamond" w:cs="Arial"/>
+          <w:spacing w:val="1"/>
+        </w:rPr>
+        <w:t xml:space="preserve"> </w:t>
+      </w:r>
+      <w:proofErr w:type="spellStart"/>
+      <w:r>
+        <w:rPr>
+          <w:rFonts w:ascii="Garamond" w:eastAsia="Arial MT" w:hAnsi="Garamond" w:cs="Arial"/>
+          <w:spacing w:val="1"/>
+        </w:rPr>
+        <w:t>descripcion</w:t>
+      </w:r>
+      <w:proofErr w:type="spellEnd"/>
       <w:r>
         <w:rPr>
           <w:rFonts w:ascii="Garamond" w:eastAsia="Arial MT" w:hAnsi="Garamond" w:cs="Arial"/>

</xml_diff>